<commit_message>
Document KRX API expiry and contract status
</commit_message>
<xml_diff>
--- a/docs/IPO_데이터_거버넌스_및_백엔드_파이프라인_설계서.docx
+++ b/docs/IPO_데이터_거버넌스_및_백엔드_파이프라인_설계서.docx
@@ -43,6 +43,7 @@
       <w:tr>
         <w:trPr>
           <w:tblHeader w:val="true"/>
+          <w:cantSplit/>
         </w:trPr>
         <w:tc>
           <w:tcPr>
@@ -96,6 +97,9 @@
         </w:tc>
       </w:tr>
       <w:tr>
+        <w:trPr>
+          <w:cantSplit/>
+        </w:trPr>
         <w:tc>
           <w:tcPr>
             <w:tcW w:type="dxa" w:w="1800"/>
@@ -130,6 +134,9 @@
         </w:tc>
       </w:tr>
       <w:tr>
+        <w:trPr>
+          <w:cantSplit/>
+        </w:trPr>
         <w:tc>
           <w:tcPr>
             <w:tcW w:type="dxa" w:w="1800"/>
@@ -164,6 +171,9 @@
         </w:tc>
       </w:tr>
       <w:tr>
+        <w:trPr>
+          <w:cantSplit/>
+        </w:trPr>
         <w:tc>
           <w:tcPr>
             <w:tcW w:type="dxa" w:w="1800"/>
@@ -198,6 +208,9 @@
         </w:tc>
       </w:tr>
       <w:tr>
+        <w:trPr>
+          <w:cantSplit/>
+        </w:trPr>
         <w:tc>
           <w:tcPr>
             <w:tcW w:type="dxa" w:w="1800"/>
@@ -226,7 +239,7 @@
               <w:rPr>
                 <w:sz w:val="19"/>
               </w:rPr>
-              <w:t>2026-08-24</w:t>
+              <w:t>2026-08-25</w:t>
             </w:r>
           </w:p>
         </w:tc>
@@ -341,7 +354,7 @@
     </w:p>
     <w:p>
       <w:r>
-        <w:t>인증정보는 코드, Git, 문서, 로그에 직접 넣지 않는다. 현재 코드는 운영체제 환경변수에서 값을 읽으므로 개발 PC에서는 터미널 환경변수로 주입한다. 향후 .env 방식을 도입할 경우에는 전용 로더를 추가하고 Git에 포함하지 않는다. 운영 환경은 클라우드 Secret Manager 또는 배포 플랫폼의 Secret 기능을 사용한다. 애플리케이션은 시작할 때만 비밀값을 읽고 이후에는 값 자체를 출력하지 않는다.</w:t>
+        <w:t>인증정보는 코드, Git, 문서, 로그에 직접 넣지 않는다. 개발 PC에서는 터미널 환경변수로 주입하고, 운영 환경은 클라우드 Secret Manager 또는 배포 플랫폼의 Secret 기능을 사용한다. KRX는 개인 ID·비밀번호 로그인 수집을 출시 구조에서 사용하지 않고, 승인된 KRX OpenAPI 인증키를 AUTH_KEY 요청 헤더로 전송한다. 애플리케이션은 시작할 때만 비밀값을 읽고 이후에는 값 자체를 출력하지 않는다.</w:t>
       </w:r>
     </w:p>
     <w:tbl>
@@ -361,6 +374,7 @@
       <w:tr>
         <w:trPr>
           <w:tblHeader w:val="true"/>
+          <w:cantSplit/>
         </w:trPr>
         <w:tc>
           <w:tcPr>
@@ -464,6 +478,9 @@
         </w:tc>
       </w:tr>
       <w:tr>
+        <w:trPr>
+          <w:cantSplit/>
+        </w:trPr>
         <w:tc>
           <w:tcPr>
             <w:tcW w:type="dxa" w:w="1200"/>
@@ -492,7 +509,7 @@
               <w:rPr>
                 <w:sz w:val="19"/>
               </w:rPr>
-              <w:t>터미널 환경변수 (현재 코드)</w:t>
+              <w:t>터미널 환경변수</w:t>
             </w:r>
           </w:p>
         </w:tc>
@@ -508,7 +525,7 @@
               <w:rPr>
                 <w:sz w:val="19"/>
               </w:rPr>
-              <w:t>DART_API_KEY, KRX_ID, KRX_PASSWORD</w:t>
+              <w:t>DART_API_KEY, KRX_API_KEY</w:t>
             </w:r>
           </w:p>
         </w:tc>
@@ -524,12 +541,15 @@
               <w:rPr>
                 <w:sz w:val="19"/>
               </w:rPr>
-              <w:t>collect 명령이 키 누락 오류 없이 시작되는지 확인</w:t>
+              <w:t>승인된 KRX API 샘플 호출과 DART 연결 확인</w:t>
             </w:r>
           </w:p>
         </w:tc>
       </w:tr>
       <w:tr>
+        <w:trPr>
+          <w:cantSplit/>
+        </w:trPr>
         <w:tc>
           <w:tcPr>
             <w:tcW w:type="dxa" w:w="1200"/>
@@ -596,6 +616,9 @@
         </w:tc>
       </w:tr>
       <w:tr>
+        <w:trPr>
+          <w:cantSplit/>
+        </w:trPr>
         <w:tc>
           <w:tcPr>
             <w:tcW w:type="dxa" w:w="1200"/>
@@ -686,12 +709,64 @@
         </w:rPr>
         <w:t>export DART_API_KEY=발급받은_40자리_키</w:t>
         <w:br/>
-        <w:t>export KRX_ID=개인_KRX_아이디</w:t>
-        <w:br/>
-        <w:t>export KRX_PASSWORD=개인_KRX_비밀번호</w:t>
+        <w:t>export KRX_API_KEY=발급받은_KRX_OpenAPI_인증키</w:t>
         <w:br/>
         <w:t>python pipeline.py --mode collect --start-year 2020 --end-year 2025 --phase phase2</w:t>
       </w:r>
+    </w:p>
+    <w:tbl>
+      <w:tblPr>
+        <w:tblW w:type="dxa" w:w="9360"/>
+        <w:tblLayout w:type="fixed"/>
+        <w:tblLook w:firstColumn="1" w:firstRow="1" w:lastColumn="0" w:lastRow="0" w:noHBand="0" w:noVBand="1" w:val="04A0"/>
+        <w:tblInd w:w="120" w:type="dxa"/>
+      </w:tblPr>
+      <w:tblGrid>
+        <w:gridCol w:w="9360"/>
+      </w:tblGrid>
+      <w:tr>
+        <w:trPr>
+          <w:tblHeader w:val="true"/>
+        </w:trPr>
+        <w:tc>
+          <w:tcPr>
+            <w:tcW w:type="dxa" w:w="9360"/>
+            <w:vAlign w:val="center"/>
+            <w:tcMar>
+              <w:top w:w="80" w:type="dxa"/>
+              <w:start w:w="120" w:type="dxa"/>
+              <w:bottom w:w="80" w:type="dxa"/>
+              <w:end w:w="120" w:type="dxa"/>
+            </w:tcMar>
+            <w:shd w:fill="F4F6F9"/>
+          </w:tcPr>
+          <w:p>
+            <w:pPr>
+              <w:spacing w:after="40"/>
+            </w:pPr>
+            <w:r>
+              <w:rPr>
+                <w:b/>
+                <w:color w:val="1F4D78"/>
+              </w:rPr>
+              <w:t>적용 상태</w:t>
+            </w:r>
+          </w:p>
+          <w:p>
+            <w:pPr>
+              <w:spacing w:after="0"/>
+            </w:pPr>
+            <w:r>
+              <w:t>위 예시는 KRX OpenAPI 수집기 교체 후의 목표 설정이다. 현재 개인 로그인 방식 수집기는 공식 API 수집기로 교체되기 전까지 배포 환경에서 사용하지 않는다.</w:t>
+            </w:r>
+          </w:p>
+        </w:tc>
+      </w:tr>
+    </w:tbl>
+    <w:p>
+      <w:pPr>
+        <w:spacing w:after="40"/>
+      </w:pPr>
     </w:p>
     <w:tbl>
       <w:tblPr>
@@ -776,6 +851,7 @@
       <w:tr>
         <w:trPr>
           <w:tblHeader w:val="true"/>
+          <w:cantSplit/>
         </w:trPr>
         <w:tc>
           <w:tcPr>
@@ -854,6 +930,9 @@
         </w:tc>
       </w:tr>
       <w:tr>
+        <w:trPr>
+          <w:cantSplit/>
+        </w:trPr>
         <w:tc>
           <w:tcPr>
             <w:tcW w:type="dxa" w:w="1600"/>
@@ -904,6 +983,9 @@
         </w:tc>
       </w:tr>
       <w:tr>
+        <w:trPr>
+          <w:cantSplit/>
+        </w:trPr>
         <w:tc>
           <w:tcPr>
             <w:tcW w:type="dxa" w:w="1600"/>
@@ -954,6 +1036,9 @@
         </w:tc>
       </w:tr>
       <w:tr>
+        <w:trPr>
+          <w:cantSplit/>
+        </w:trPr>
         <w:tc>
           <w:tcPr>
             <w:tcW w:type="dxa" w:w="1600"/>
@@ -1004,6 +1089,9 @@
         </w:tc>
       </w:tr>
       <w:tr>
+        <w:trPr>
+          <w:cantSplit/>
+        </w:trPr>
         <w:tc>
           <w:tcPr>
             <w:tcW w:type="dxa" w:w="1600"/>
@@ -1054,6 +1142,9 @@
         </w:tc>
       </w:tr>
       <w:tr>
+        <w:trPr>
+          <w:cantSplit/>
+        </w:trPr>
         <w:tc>
           <w:tcPr>
             <w:tcW w:type="dxa" w:w="1600"/>
@@ -1134,6 +1225,7 @@
       <w:tr>
         <w:trPr>
           <w:tblHeader w:val="true"/>
+          <w:cantSplit/>
         </w:trPr>
         <w:tc>
           <w:tcPr>
@@ -1237,6 +1329,9 @@
         </w:tc>
       </w:tr>
       <w:tr>
+        <w:trPr>
+          <w:cantSplit/>
+        </w:trPr>
         <w:tc>
           <w:tcPr>
             <w:tcW w:type="dxa" w:w="1000"/>
@@ -1303,6 +1398,9 @@
         </w:tc>
       </w:tr>
       <w:tr>
+        <w:trPr>
+          <w:cantSplit/>
+        </w:trPr>
         <w:tc>
           <w:tcPr>
             <w:tcW w:type="dxa" w:w="1000"/>
@@ -1369,6 +1467,9 @@
         </w:tc>
       </w:tr>
       <w:tr>
+        <w:trPr>
+          <w:cantSplit/>
+        </w:trPr>
         <w:tc>
           <w:tcPr>
             <w:tcW w:type="dxa" w:w="1000"/>
@@ -1397,7 +1498,7 @@
               <w:rPr>
                 <w:sz w:val="19"/>
               </w:rPr>
-              <w:t>API 키, KRX ID·비밀번호, DB 비밀번호</w:t>
+              <w:t>DART·KRX API 키, DB 비밀번호</w:t>
             </w:r>
           </w:p>
         </w:tc>
@@ -1435,6 +1536,9 @@
         </w:tc>
       </w:tr>
       <w:tr>
+        <w:trPr>
+          <w:cantSplit/>
+        </w:trPr>
         <w:tc>
           <w:tcPr>
             <w:tcW w:type="dxa" w:w="1000"/>
@@ -1584,6 +1688,7 @@
       <w:tr>
         <w:trPr>
           <w:tblHeader w:val="true"/>
+          <w:cantSplit/>
         </w:trPr>
         <w:tc>
           <w:tcPr>
@@ -1662,6 +1767,9 @@
         </w:tc>
       </w:tr>
       <w:tr>
+        <w:trPr>
+          <w:cantSplit/>
+        </w:trPr>
         <w:tc>
           <w:tcPr>
             <w:tcW w:type="dxa" w:w="1500"/>
@@ -1712,6 +1820,9 @@
         </w:tc>
       </w:tr>
       <w:tr>
+        <w:trPr>
+          <w:cantSplit/>
+        </w:trPr>
         <w:tc>
           <w:tcPr>
             <w:tcW w:type="dxa" w:w="1500"/>
@@ -1762,6 +1873,9 @@
         </w:tc>
       </w:tr>
       <w:tr>
+        <w:trPr>
+          <w:cantSplit/>
+        </w:trPr>
         <w:tc>
           <w:tcPr>
             <w:tcW w:type="dxa" w:w="1500"/>
@@ -1812,6 +1926,9 @@
         </w:tc>
       </w:tr>
       <w:tr>
+        <w:trPr>
+          <w:cantSplit/>
+        </w:trPr>
         <w:tc>
           <w:tcPr>
             <w:tcW w:type="dxa" w:w="1500"/>
@@ -1862,6 +1979,9 @@
         </w:tc>
       </w:tr>
       <w:tr>
+        <w:trPr>
+          <w:cantSplit/>
+        </w:trPr>
         <w:tc>
           <w:tcPr>
             <w:tcW w:type="dxa" w:w="1500"/>
@@ -1996,6 +2116,7 @@
       <w:tr>
         <w:trPr>
           <w:tblHeader w:val="true"/>
+          <w:cantSplit/>
         </w:trPr>
         <w:tc>
           <w:tcPr>
@@ -2099,6 +2220,9 @@
         </w:tc>
       </w:tr>
       <w:tr>
+        <w:trPr>
+          <w:cantSplit/>
+        </w:trPr>
         <w:tc>
           <w:tcPr>
             <w:tcW w:type="dxa" w:w="1200"/>
@@ -2165,6 +2289,9 @@
         </w:tc>
       </w:tr>
       <w:tr>
+        <w:trPr>
+          <w:cantSplit/>
+        </w:trPr>
         <w:tc>
           <w:tcPr>
             <w:tcW w:type="dxa" w:w="1200"/>
@@ -2231,6 +2358,9 @@
         </w:tc>
       </w:tr>
       <w:tr>
+        <w:trPr>
+          <w:cantSplit/>
+        </w:trPr>
         <w:tc>
           <w:tcPr>
             <w:tcW w:type="dxa" w:w="1200"/>
@@ -2297,6 +2427,9 @@
         </w:tc>
       </w:tr>
       <w:tr>
+        <w:trPr>
+          <w:cantSplit/>
+        </w:trPr>
         <w:tc>
           <w:tcPr>
             <w:tcW w:type="dxa" w:w="1200"/>
@@ -2363,6 +2496,9 @@
         </w:tc>
       </w:tr>
       <w:tr>
+        <w:trPr>
+          <w:cantSplit/>
+        </w:trPr>
         <w:tc>
           <w:tcPr>
             <w:tcW w:type="dxa" w:w="1200"/>
@@ -2429,6 +2565,9 @@
         </w:tc>
       </w:tr>
       <w:tr>
+        <w:trPr>
+          <w:cantSplit/>
+        </w:trPr>
         <w:tc>
           <w:tcPr>
             <w:tcW w:type="dxa" w:w="1200"/>
@@ -2495,6 +2634,9 @@
         </w:tc>
       </w:tr>
       <w:tr>
+        <w:trPr>
+          <w:cantSplit/>
+        </w:trPr>
         <w:tc>
           <w:tcPr>
             <w:tcW w:type="dxa" w:w="1200"/>
@@ -2561,6 +2703,9 @@
         </w:tc>
       </w:tr>
       <w:tr>
+        <w:trPr>
+          <w:cantSplit/>
+        </w:trPr>
         <w:tc>
           <w:tcPr>
             <w:tcW w:type="dxa" w:w="1200"/>
@@ -2715,6 +2860,7 @@
       <w:tr>
         <w:trPr>
           <w:tblHeader w:val="true"/>
+          <w:cantSplit/>
         </w:trPr>
         <w:tc>
           <w:tcPr>
@@ -2818,6 +2964,9 @@
         </w:tc>
       </w:tr>
       <w:tr>
+        <w:trPr>
+          <w:cantSplit/>
+        </w:trPr>
         <w:tc>
           <w:tcPr>
             <w:tcW w:type="dxa" w:w="1300"/>
@@ -2884,6 +3033,9 @@
         </w:tc>
       </w:tr>
       <w:tr>
+        <w:trPr>
+          <w:cantSplit/>
+        </w:trPr>
         <w:tc>
           <w:tcPr>
             <w:tcW w:type="dxa" w:w="1300"/>
@@ -2950,6 +3102,9 @@
         </w:tc>
       </w:tr>
       <w:tr>
+        <w:trPr>
+          <w:cantSplit/>
+        </w:trPr>
         <w:tc>
           <w:tcPr>
             <w:tcW w:type="dxa" w:w="1300"/>
@@ -3016,6 +3171,9 @@
         </w:tc>
       </w:tr>
       <w:tr>
+        <w:trPr>
+          <w:cantSplit/>
+        </w:trPr>
         <w:tc>
           <w:tcPr>
             <w:tcW w:type="dxa" w:w="1300"/>
@@ -3082,6 +3240,9 @@
         </w:tc>
       </w:tr>
       <w:tr>
+        <w:trPr>
+          <w:cantSplit/>
+        </w:trPr>
         <w:tc>
           <w:tcPr>
             <w:tcW w:type="dxa" w:w="1300"/>
@@ -3230,6 +3391,7 @@
       <w:tr>
         <w:trPr>
           <w:tblHeader w:val="true"/>
+          <w:cantSplit/>
         </w:trPr>
         <w:tc>
           <w:tcPr>
@@ -3283,6 +3445,9 @@
         </w:tc>
       </w:tr>
       <w:tr>
+        <w:trPr>
+          <w:cantSplit/>
+        </w:trPr>
         <w:tc>
           <w:tcPr>
             <w:tcW w:type="dxa" w:w="1900"/>
@@ -3317,6 +3482,9 @@
         </w:tc>
       </w:tr>
       <w:tr>
+        <w:trPr>
+          <w:cantSplit/>
+        </w:trPr>
         <w:tc>
           <w:tcPr>
             <w:tcW w:type="dxa" w:w="1900"/>
@@ -3351,6 +3519,9 @@
         </w:tc>
       </w:tr>
       <w:tr>
+        <w:trPr>
+          <w:cantSplit/>
+        </w:trPr>
         <w:tc>
           <w:tcPr>
             <w:tcW w:type="dxa" w:w="1900"/>
@@ -3385,6 +3556,9 @@
         </w:tc>
       </w:tr>
       <w:tr>
+        <w:trPr>
+          <w:cantSplit/>
+        </w:trPr>
         <w:tc>
           <w:tcPr>
             <w:tcW w:type="dxa" w:w="1900"/>
@@ -3419,6 +3593,9 @@
         </w:tc>
       </w:tr>
       <w:tr>
+        <w:trPr>
+          <w:cantSplit/>
+        </w:trPr>
         <w:tc>
           <w:tcPr>
             <w:tcW w:type="dxa" w:w="1900"/>
@@ -3453,6 +3630,9 @@
         </w:tc>
       </w:tr>
       <w:tr>
+        <w:trPr>
+          <w:cantSplit/>
+        </w:trPr>
         <w:tc>
           <w:tcPr>
             <w:tcW w:type="dxa" w:w="1900"/>
@@ -3520,6 +3700,7 @@
       <w:tr>
         <w:trPr>
           <w:tblHeader w:val="true"/>
+          <w:cantSplit/>
         </w:trPr>
         <w:tc>
           <w:tcPr>
@@ -3573,6 +3754,9 @@
         </w:tc>
       </w:tr>
       <w:tr>
+        <w:trPr>
+          <w:cantSplit/>
+        </w:trPr>
         <w:tc>
           <w:tcPr>
             <w:tcW w:type="dxa" w:w="2000"/>
@@ -3607,6 +3791,9 @@
         </w:tc>
       </w:tr>
       <w:tr>
+        <w:trPr>
+          <w:cantSplit/>
+        </w:trPr>
         <w:tc>
           <w:tcPr>
             <w:tcW w:type="dxa" w:w="2000"/>
@@ -3641,6 +3828,9 @@
         </w:tc>
       </w:tr>
       <w:tr>
+        <w:trPr>
+          <w:cantSplit/>
+        </w:trPr>
         <w:tc>
           <w:tcPr>
             <w:tcW w:type="dxa" w:w="2000"/>
@@ -3675,6 +3865,9 @@
         </w:tc>
       </w:tr>
       <w:tr>
+        <w:trPr>
+          <w:cantSplit/>
+        </w:trPr>
         <w:tc>
           <w:tcPr>
             <w:tcW w:type="dxa" w:w="2000"/>
@@ -3709,6 +3902,9 @@
         </w:tc>
       </w:tr>
       <w:tr>
+        <w:trPr>
+          <w:cantSplit/>
+        </w:trPr>
         <w:tc>
           <w:tcPr>
             <w:tcW w:type="dxa" w:w="2000"/>
@@ -3772,6 +3968,7 @@
       <w:tr>
         <w:trPr>
           <w:tblHeader w:val="true"/>
+          <w:cantSplit/>
         </w:trPr>
         <w:tc>
           <w:tcPr>
@@ -3850,6 +4047,9 @@
         </w:tc>
       </w:tr>
       <w:tr>
+        <w:trPr>
+          <w:cantSplit/>
+        </w:trPr>
         <w:tc>
           <w:tcPr>
             <w:tcW w:type="dxa" w:w="2000"/>
@@ -3900,6 +4100,9 @@
         </w:tc>
       </w:tr>
       <w:tr>
+        <w:trPr>
+          <w:cantSplit/>
+        </w:trPr>
         <w:tc>
           <w:tcPr>
             <w:tcW w:type="dxa" w:w="2000"/>
@@ -3950,6 +4153,9 @@
         </w:tc>
       </w:tr>
       <w:tr>
+        <w:trPr>
+          <w:cantSplit/>
+        </w:trPr>
         <w:tc>
           <w:tcPr>
             <w:tcW w:type="dxa" w:w="2000"/>
@@ -4000,6 +4206,9 @@
         </w:tc>
       </w:tr>
       <w:tr>
+        <w:trPr>
+          <w:cantSplit/>
+        </w:trPr>
         <w:tc>
           <w:tcPr>
             <w:tcW w:type="dxa" w:w="2000"/>
@@ -4050,6 +4259,9 @@
         </w:tc>
       </w:tr>
       <w:tr>
+        <w:trPr>
+          <w:cantSplit/>
+        </w:trPr>
         <w:tc>
           <w:tcPr>
             <w:tcW w:type="dxa" w:w="2000"/>
@@ -4110,7 +4322,926 @@
         <w:pStyle w:val="Heading1"/>
       </w:pPr>
       <w:r>
-        <w:t>10. 단계별 구현 로드맵</w:t>
+        <w:t>10. API·계약 유효기간 관리</w:t>
+      </w:r>
+    </w:p>
+    <w:p>
+      <w:r>
+        <w:t>기준일은 2026-08-25이며, 아래 상태는 KRX OpenAPI 이용현황 화면에서 확인한 승인 결과를 기준으로 한다. 인증키 값 자체는 문서·소스·로그에 적지 않는다. 갱신 책임자는 서비스 오너, 실행 담당은 플랫폼/보안 오너로 지정한다.</w:t>
+      </w:r>
+    </w:p>
+    <w:tbl>
+      <w:tblPr>
+        <w:tblStyle w:val="TableGrid"/>
+        <w:tblW w:type="dxa" w:w="9360"/>
+        <w:tblLayout w:type="fixed"/>
+        <w:tblLook w:firstColumn="1" w:firstRow="1" w:lastColumn="0" w:lastRow="0" w:noHBand="0" w:noVBand="1" w:val="04A0"/>
+        <w:tblInd w:w="120" w:type="dxa"/>
+      </w:tblPr>
+      <w:tblGrid>
+        <w:gridCol w:w="2800"/>
+        <w:gridCol w:w="2700"/>
+        <w:gridCol w:w="950"/>
+        <w:gridCol w:w="2910"/>
+      </w:tblGrid>
+      <w:tr>
+        <w:trPr>
+          <w:tblHeader w:val="true"/>
+          <w:cantSplit/>
+        </w:trPr>
+        <w:tc>
+          <w:tcPr>
+            <w:tcW w:type="dxa" w:w="2800"/>
+            <w:vAlign w:val="center"/>
+            <w:tcMar>
+              <w:top w:w="80" w:type="dxa"/>
+              <w:start w:w="120" w:type="dxa"/>
+              <w:bottom w:w="80" w:type="dxa"/>
+              <w:end w:w="120" w:type="dxa"/>
+            </w:tcMar>
+            <w:shd w:fill="E8EEF5"/>
+          </w:tcPr>
+          <w:p>
+            <w:pPr>
+              <w:spacing w:after="0"/>
+            </w:pPr>
+            <w:r>
+              <w:rPr>
+                <w:b/>
+                <w:sz w:val="19"/>
+              </w:rPr>
+              <w:t>승인 API</w:t>
+            </w:r>
+          </w:p>
+        </w:tc>
+        <w:tc>
+          <w:tcPr>
+            <w:tcW w:type="dxa" w:w="2700"/>
+            <w:vAlign w:val="center"/>
+            <w:tcMar>
+              <w:top w:w="80" w:type="dxa"/>
+              <w:start w:w="120" w:type="dxa"/>
+              <w:bottom w:w="80" w:type="dxa"/>
+              <w:end w:w="120" w:type="dxa"/>
+            </w:tcMar>
+            <w:shd w:fill="E8EEF5"/>
+          </w:tcPr>
+          <w:p>
+            <w:pPr>
+              <w:spacing w:after="0"/>
+            </w:pPr>
+            <w:r>
+              <w:rPr>
+                <w:b/>
+                <w:sz w:val="19"/>
+              </w:rPr>
+              <w:t>사용기간</w:t>
+            </w:r>
+          </w:p>
+        </w:tc>
+        <w:tc>
+          <w:tcPr>
+            <w:tcW w:type="dxa" w:w="950"/>
+            <w:vAlign w:val="center"/>
+            <w:tcMar>
+              <w:top w:w="80" w:type="dxa"/>
+              <w:start w:w="120" w:type="dxa"/>
+              <w:bottom w:w="80" w:type="dxa"/>
+              <w:end w:w="120" w:type="dxa"/>
+            </w:tcMar>
+            <w:shd w:fill="E8EEF5"/>
+          </w:tcPr>
+          <w:p>
+            <w:pPr>
+              <w:spacing w:after="0"/>
+            </w:pPr>
+            <w:r>
+              <w:rPr>
+                <w:b/>
+                <w:sz w:val="19"/>
+              </w:rPr>
+              <w:t>상태</w:t>
+            </w:r>
+          </w:p>
+        </w:tc>
+        <w:tc>
+          <w:tcPr>
+            <w:tcW w:type="dxa" w:w="2910"/>
+            <w:vAlign w:val="center"/>
+            <w:tcMar>
+              <w:top w:w="80" w:type="dxa"/>
+              <w:start w:w="120" w:type="dxa"/>
+              <w:bottom w:w="80" w:type="dxa"/>
+              <w:end w:w="120" w:type="dxa"/>
+            </w:tcMar>
+            <w:shd w:fill="E8EEF5"/>
+          </w:tcPr>
+          <w:p>
+            <w:pPr>
+              <w:spacing w:after="0"/>
+            </w:pPr>
+            <w:r>
+              <w:rPr>
+                <w:b/>
+                <w:sz w:val="19"/>
+              </w:rPr>
+              <w:t>서비스 역할</w:t>
+            </w:r>
+          </w:p>
+        </w:tc>
+      </w:tr>
+      <w:tr>
+        <w:trPr>
+          <w:cantSplit/>
+        </w:trPr>
+        <w:tc>
+          <w:tcPr>
+            <w:tcW w:type="dxa" w:w="2800"/>
+          </w:tcPr>
+          <w:p>
+            <w:pPr>
+              <w:spacing w:after="0"/>
+            </w:pPr>
+            <w:r>
+              <w:rPr>
+                <w:sz w:val="19"/>
+              </w:rPr>
+              <w:t>KOSDAQ 시리즈 일별시세정보</w:t>
+            </w:r>
+          </w:p>
+        </w:tc>
+        <w:tc>
+          <w:tcPr>
+            <w:tcW w:type="dxa" w:w="2700"/>
+          </w:tcPr>
+          <w:p>
+            <w:pPr>
+              <w:spacing w:after="0"/>
+            </w:pPr>
+            <w:r>
+              <w:rPr>
+                <w:sz w:val="19"/>
+              </w:rPr>
+              <w:t>2026-08-25 ~ 2027-08-24</w:t>
+            </w:r>
+          </w:p>
+        </w:tc>
+        <w:tc>
+          <w:tcPr>
+            <w:tcW w:type="dxa" w:w="950"/>
+          </w:tcPr>
+          <w:p>
+            <w:pPr>
+              <w:spacing w:after="0"/>
+            </w:pPr>
+            <w:r>
+              <w:rPr>
+                <w:sz w:val="19"/>
+              </w:rPr>
+              <w:t>승인</w:t>
+            </w:r>
+          </w:p>
+        </w:tc>
+        <w:tc>
+          <w:tcPr>
+            <w:tcW w:type="dxa" w:w="2910"/>
+          </w:tcPr>
+          <w:p>
+            <w:pPr>
+              <w:spacing w:after="0"/>
+            </w:pPr>
+            <w:r>
+              <w:rPr>
+                <w:sz w:val="19"/>
+              </w:rPr>
+              <w:t>코스닥 시장 모멘텀 피처</w:t>
+            </w:r>
+          </w:p>
+        </w:tc>
+      </w:tr>
+      <w:tr>
+        <w:trPr>
+          <w:cantSplit/>
+        </w:trPr>
+        <w:tc>
+          <w:tcPr>
+            <w:tcW w:type="dxa" w:w="2800"/>
+          </w:tcPr>
+          <w:p>
+            <w:pPr>
+              <w:spacing w:after="0"/>
+            </w:pPr>
+            <w:r>
+              <w:rPr>
+                <w:sz w:val="19"/>
+              </w:rPr>
+              <w:t>코스닥 일별매매정보</w:t>
+            </w:r>
+          </w:p>
+        </w:tc>
+        <w:tc>
+          <w:tcPr>
+            <w:tcW w:type="dxa" w:w="2700"/>
+          </w:tcPr>
+          <w:p>
+            <w:pPr>
+              <w:spacing w:after="0"/>
+            </w:pPr>
+            <w:r>
+              <w:rPr>
+                <w:sz w:val="19"/>
+              </w:rPr>
+              <w:t>2026-08-25 ~ 2027-08-24</w:t>
+            </w:r>
+          </w:p>
+        </w:tc>
+        <w:tc>
+          <w:tcPr>
+            <w:tcW w:type="dxa" w:w="950"/>
+          </w:tcPr>
+          <w:p>
+            <w:pPr>
+              <w:spacing w:after="0"/>
+            </w:pPr>
+            <w:r>
+              <w:rPr>
+                <w:sz w:val="19"/>
+              </w:rPr>
+              <w:t>승인</w:t>
+            </w:r>
+          </w:p>
+        </w:tc>
+        <w:tc>
+          <w:tcPr>
+            <w:tcW w:type="dxa" w:w="2910"/>
+          </w:tcPr>
+          <w:p>
+            <w:pPr>
+              <w:spacing w:after="0"/>
+            </w:pPr>
+            <w:r>
+              <w:rPr>
+                <w:sz w:val="19"/>
+              </w:rPr>
+              <w:t>코스닥 상장일 시초가·종가 실측</w:t>
+            </w:r>
+          </w:p>
+        </w:tc>
+      </w:tr>
+      <w:tr>
+        <w:trPr>
+          <w:cantSplit/>
+        </w:trPr>
+        <w:tc>
+          <w:tcPr>
+            <w:tcW w:type="dxa" w:w="2800"/>
+          </w:tcPr>
+          <w:p>
+            <w:pPr>
+              <w:spacing w:after="0"/>
+            </w:pPr>
+            <w:r>
+              <w:rPr>
+                <w:sz w:val="19"/>
+              </w:rPr>
+              <w:t>유가증권 종목기본정보</w:t>
+            </w:r>
+          </w:p>
+        </w:tc>
+        <w:tc>
+          <w:tcPr>
+            <w:tcW w:type="dxa" w:w="2700"/>
+          </w:tcPr>
+          <w:p>
+            <w:pPr>
+              <w:spacing w:after="0"/>
+            </w:pPr>
+            <w:r>
+              <w:rPr>
+                <w:sz w:val="19"/>
+              </w:rPr>
+              <w:t>2026-08-25 ~ 2027-08-24</w:t>
+            </w:r>
+          </w:p>
+        </w:tc>
+        <w:tc>
+          <w:tcPr>
+            <w:tcW w:type="dxa" w:w="950"/>
+          </w:tcPr>
+          <w:p>
+            <w:pPr>
+              <w:spacing w:after="0"/>
+            </w:pPr>
+            <w:r>
+              <w:rPr>
+                <w:sz w:val="19"/>
+              </w:rPr>
+              <w:t>승인</w:t>
+            </w:r>
+          </w:p>
+        </w:tc>
+        <w:tc>
+          <w:tcPr>
+            <w:tcW w:type="dxa" w:w="2910"/>
+          </w:tcPr>
+          <w:p>
+            <w:pPr>
+              <w:spacing w:after="0"/>
+            </w:pPr>
+            <w:r>
+              <w:rPr>
+                <w:sz w:val="19"/>
+              </w:rPr>
+              <w:t>유가증권 종목·상장정보 정합</w:t>
+            </w:r>
+          </w:p>
+        </w:tc>
+      </w:tr>
+      <w:tr>
+        <w:trPr>
+          <w:cantSplit/>
+        </w:trPr>
+        <w:tc>
+          <w:tcPr>
+            <w:tcW w:type="dxa" w:w="2800"/>
+          </w:tcPr>
+          <w:p>
+            <w:pPr>
+              <w:spacing w:after="0"/>
+            </w:pPr>
+            <w:r>
+              <w:rPr>
+                <w:sz w:val="19"/>
+              </w:rPr>
+              <w:t>유가증권 일별매매정보</w:t>
+            </w:r>
+          </w:p>
+        </w:tc>
+        <w:tc>
+          <w:tcPr>
+            <w:tcW w:type="dxa" w:w="2700"/>
+          </w:tcPr>
+          <w:p>
+            <w:pPr>
+              <w:spacing w:after="0"/>
+            </w:pPr>
+            <w:r>
+              <w:rPr>
+                <w:sz w:val="19"/>
+              </w:rPr>
+              <w:t>2026-08-25 ~ 2027-08-24</w:t>
+            </w:r>
+          </w:p>
+        </w:tc>
+        <w:tc>
+          <w:tcPr>
+            <w:tcW w:type="dxa" w:w="950"/>
+          </w:tcPr>
+          <w:p>
+            <w:pPr>
+              <w:spacing w:after="0"/>
+            </w:pPr>
+            <w:r>
+              <w:rPr>
+                <w:sz w:val="19"/>
+              </w:rPr>
+              <w:t>승인</w:t>
+            </w:r>
+          </w:p>
+        </w:tc>
+        <w:tc>
+          <w:tcPr>
+            <w:tcW w:type="dxa" w:w="2910"/>
+          </w:tcPr>
+          <w:p>
+            <w:pPr>
+              <w:spacing w:after="0"/>
+            </w:pPr>
+            <w:r>
+              <w:rPr>
+                <w:sz w:val="19"/>
+              </w:rPr>
+              <w:t>유가증권 상장일 시초가·종가 실측</w:t>
+            </w:r>
+          </w:p>
+        </w:tc>
+      </w:tr>
+      <w:tr>
+        <w:trPr>
+          <w:cantSplit/>
+        </w:trPr>
+        <w:tc>
+          <w:tcPr>
+            <w:tcW w:type="dxa" w:w="2800"/>
+          </w:tcPr>
+          <w:p>
+            <w:pPr>
+              <w:spacing w:after="0"/>
+            </w:pPr>
+            <w:r>
+              <w:rPr>
+                <w:sz w:val="19"/>
+              </w:rPr>
+              <w:t>KOSPI 시리즈 일별시세정보</w:t>
+            </w:r>
+          </w:p>
+        </w:tc>
+        <w:tc>
+          <w:tcPr>
+            <w:tcW w:type="dxa" w:w="2700"/>
+          </w:tcPr>
+          <w:p>
+            <w:pPr>
+              <w:spacing w:after="0"/>
+            </w:pPr>
+            <w:r>
+              <w:rPr>
+                <w:sz w:val="19"/>
+              </w:rPr>
+              <w:t>2026-08-25 ~ 2027-08-24</w:t>
+            </w:r>
+          </w:p>
+        </w:tc>
+        <w:tc>
+          <w:tcPr>
+            <w:tcW w:type="dxa" w:w="950"/>
+          </w:tcPr>
+          <w:p>
+            <w:pPr>
+              <w:spacing w:after="0"/>
+            </w:pPr>
+            <w:r>
+              <w:rPr>
+                <w:sz w:val="19"/>
+              </w:rPr>
+              <w:t>승인</w:t>
+            </w:r>
+          </w:p>
+        </w:tc>
+        <w:tc>
+          <w:tcPr>
+            <w:tcW w:type="dxa" w:w="2910"/>
+          </w:tcPr>
+          <w:p>
+            <w:pPr>
+              <w:spacing w:after="0"/>
+            </w:pPr>
+            <w:r>
+              <w:rPr>
+                <w:sz w:val="19"/>
+              </w:rPr>
+              <w:t>유가증권 시장 모멘텀 피처</w:t>
+            </w:r>
+          </w:p>
+        </w:tc>
+      </w:tr>
+      <w:tr>
+        <w:trPr>
+          <w:cantSplit/>
+        </w:trPr>
+        <w:tc>
+          <w:tcPr>
+            <w:tcW w:type="dxa" w:w="2800"/>
+          </w:tcPr>
+          <w:p>
+            <w:pPr>
+              <w:spacing w:after="0"/>
+            </w:pPr>
+            <w:r>
+              <w:rPr>
+                <w:sz w:val="19"/>
+              </w:rPr>
+              <w:t>코스닥 종목기본정보</w:t>
+            </w:r>
+          </w:p>
+        </w:tc>
+        <w:tc>
+          <w:tcPr>
+            <w:tcW w:type="dxa" w:w="2700"/>
+          </w:tcPr>
+          <w:p>
+            <w:pPr>
+              <w:spacing w:after="0"/>
+            </w:pPr>
+            <w:r>
+              <w:rPr>
+                <w:sz w:val="19"/>
+              </w:rPr>
+              <w:t>2026-08-25 ~ 2027-08-24</w:t>
+            </w:r>
+          </w:p>
+        </w:tc>
+        <w:tc>
+          <w:tcPr>
+            <w:tcW w:type="dxa" w:w="950"/>
+          </w:tcPr>
+          <w:p>
+            <w:pPr>
+              <w:spacing w:after="0"/>
+            </w:pPr>
+            <w:r>
+              <w:rPr>
+                <w:sz w:val="19"/>
+              </w:rPr>
+              <w:t>승인</w:t>
+            </w:r>
+          </w:p>
+        </w:tc>
+        <w:tc>
+          <w:tcPr>
+            <w:tcW w:type="dxa" w:w="2910"/>
+          </w:tcPr>
+          <w:p>
+            <w:pPr>
+              <w:spacing w:after="0"/>
+            </w:pPr>
+            <w:r>
+              <w:rPr>
+                <w:sz w:val="19"/>
+              </w:rPr>
+              <w:t>코스닥 종목·상장정보 정합</w:t>
+            </w:r>
+          </w:p>
+        </w:tc>
+      </w:tr>
+    </w:tbl>
+    <w:p>
+      <w:pPr>
+        <w:spacing w:after="40"/>
+      </w:pPr>
+    </w:p>
+    <w:tbl>
+      <w:tblPr>
+        <w:tblStyle w:val="TableGrid"/>
+        <w:tblW w:type="dxa" w:w="9360"/>
+        <w:tblLayout w:type="fixed"/>
+        <w:tblLook w:firstColumn="1" w:firstRow="1" w:lastColumn="0" w:lastRow="0" w:noHBand="0" w:noVBand="1" w:val="04A0"/>
+        <w:tblInd w:w="120" w:type="dxa"/>
+      </w:tblPr>
+      <w:tblGrid>
+        <w:gridCol w:w="1800"/>
+        <w:gridCol w:w="3650"/>
+        <w:gridCol w:w="3910"/>
+      </w:tblGrid>
+      <w:tr>
+        <w:trPr>
+          <w:tblHeader w:val="true"/>
+          <w:cantSplit/>
+        </w:trPr>
+        <w:tc>
+          <w:tcPr>
+            <w:tcW w:type="dxa" w:w="1800"/>
+            <w:vAlign w:val="center"/>
+            <w:tcMar>
+              <w:top w:w="80" w:type="dxa"/>
+              <w:start w:w="120" w:type="dxa"/>
+              <w:bottom w:w="80" w:type="dxa"/>
+              <w:end w:w="120" w:type="dxa"/>
+            </w:tcMar>
+            <w:shd w:fill="E8EEF5"/>
+          </w:tcPr>
+          <w:p>
+            <w:pPr>
+              <w:spacing w:after="0"/>
+            </w:pPr>
+            <w:r>
+              <w:rPr>
+                <w:b/>
+                <w:sz w:val="19"/>
+              </w:rPr>
+              <w:t>대상</w:t>
+            </w:r>
+          </w:p>
+        </w:tc>
+        <w:tc>
+          <w:tcPr>
+            <w:tcW w:type="dxa" w:w="3650"/>
+            <w:vAlign w:val="center"/>
+            <w:tcMar>
+              <w:top w:w="80" w:type="dxa"/>
+              <w:start w:w="120" w:type="dxa"/>
+              <w:bottom w:w="80" w:type="dxa"/>
+              <w:end w:w="120" w:type="dxa"/>
+            </w:tcMar>
+            <w:shd w:fill="E8EEF5"/>
+          </w:tcPr>
+          <w:p>
+            <w:pPr>
+              <w:spacing w:after="0"/>
+            </w:pPr>
+            <w:r>
+              <w:rPr>
+                <w:b/>
+                <w:sz w:val="19"/>
+              </w:rPr>
+              <w:t>유효기간·상태</w:t>
+            </w:r>
+          </w:p>
+        </w:tc>
+        <w:tc>
+          <w:tcPr>
+            <w:tcW w:type="dxa" w:w="3910"/>
+            <w:vAlign w:val="center"/>
+            <w:tcMar>
+              <w:top w:w="80" w:type="dxa"/>
+              <w:start w:w="120" w:type="dxa"/>
+              <w:bottom w:w="80" w:type="dxa"/>
+              <w:end w:w="120" w:type="dxa"/>
+            </w:tcMar>
+            <w:shd w:fill="E8EEF5"/>
+          </w:tcPr>
+          <w:p>
+            <w:pPr>
+              <w:spacing w:after="0"/>
+            </w:pPr>
+            <w:r>
+              <w:rPr>
+                <w:b/>
+                <w:sz w:val="19"/>
+              </w:rPr>
+              <w:t>운영 통제</w:t>
+            </w:r>
+          </w:p>
+        </w:tc>
+      </w:tr>
+      <w:tr>
+        <w:trPr>
+          <w:cantSplit/>
+        </w:trPr>
+        <w:tc>
+          <w:tcPr>
+            <w:tcW w:type="dxa" w:w="1800"/>
+          </w:tcPr>
+          <w:p>
+            <w:pPr>
+              <w:spacing w:after="0"/>
+            </w:pPr>
+            <w:r>
+              <w:rPr>
+                <w:sz w:val="19"/>
+              </w:rPr>
+              <w:t>KRX OpenAPI 인증키·승인 API</w:t>
+            </w:r>
+          </w:p>
+        </w:tc>
+        <w:tc>
+          <w:tcPr>
+            <w:tcW w:type="dxa" w:w="3650"/>
+          </w:tcPr>
+          <w:p>
+            <w:pPr>
+              <w:spacing w:after="0"/>
+            </w:pPr>
+            <w:r>
+              <w:rPr>
+                <w:sz w:val="19"/>
+              </w:rPr>
+              <w:t>각 승인 API는 2027-08-24 종료. KRX 약관상 인증키는 발급일로부터 1년이며 연장 요청 시 1년 단위 연장 가능.</w:t>
+            </w:r>
+          </w:p>
+        </w:tc>
+        <w:tc>
+          <w:tcPr>
+            <w:tcW w:type="dxa" w:w="3910"/>
+          </w:tcPr>
+          <w:p>
+            <w:pPr>
+              <w:spacing w:after="0"/>
+            </w:pPr>
+            <w:r>
+              <w:rPr>
+                <w:sz w:val="19"/>
+              </w:rPr>
+              <w:t>2027-07-25 갱신 시작, 2027-08-10 미갱신 알림, 2027-08-20 새 기간 샘플 호출·배치 검증, 2027-08-24 만료 전 연장 완료.</w:t>
+            </w:r>
+          </w:p>
+        </w:tc>
+      </w:tr>
+      <w:tr>
+        <w:trPr>
+          <w:cantSplit/>
+        </w:trPr>
+        <w:tc>
+          <w:tcPr>
+            <w:tcW w:type="dxa" w:w="1800"/>
+          </w:tcPr>
+          <w:p>
+            <w:pPr>
+              <w:spacing w:after="0"/>
+            </w:pPr>
+            <w:r>
+              <w:rPr>
+                <w:sz w:val="19"/>
+              </w:rPr>
+              <w:t>KRX 호출 한도</w:t>
+            </w:r>
+          </w:p>
+        </w:tc>
+        <w:tc>
+          <w:tcPr>
+            <w:tcW w:type="dxa" w:w="3650"/>
+          </w:tcPr>
+          <w:p>
+            <w:pPr>
+              <w:spacing w:after="0"/>
+            </w:pPr>
+            <w:r>
+              <w:rPr>
+                <w:sz w:val="19"/>
+              </w:rPr>
+              <w:t>키당 하루 10,000회 이하. 12개월 미사용 키는 사전 공지 없이 삭제될 수 있음.</w:t>
+            </w:r>
+          </w:p>
+        </w:tc>
+        <w:tc>
+          <w:tcPr>
+            <w:tcW w:type="dxa" w:w="3910"/>
+          </w:tcPr>
+          <w:p>
+            <w:pPr>
+              <w:spacing w:after="0"/>
+            </w:pPr>
+            <w:r>
+              <w:rPr>
+                <w:sz w:val="19"/>
+              </w:rPr>
+              <w:t>21:00 배치, 과거 적재, 재시도까지 일별 호출 수를 메트릭으로 기록하고 80%에서 경고.</w:t>
+            </w:r>
+          </w:p>
+        </w:tc>
+      </w:tr>
+      <w:tr>
+        <w:trPr>
+          <w:cantSplit/>
+        </w:trPr>
+        <w:tc>
+          <w:tcPr>
+            <w:tcW w:type="dxa" w:w="1800"/>
+          </w:tcPr>
+          <w:p>
+            <w:pPr>
+              <w:spacing w:after="0"/>
+            </w:pPr>
+            <w:r>
+              <w:rPr>
+                <w:sz w:val="19"/>
+              </w:rPr>
+              <w:t>OpenDART 인증키</w:t>
+            </w:r>
+          </w:p>
+        </w:tc>
+        <w:tc>
+          <w:tcPr>
+            <w:tcW w:type="dxa" w:w="3650"/>
+          </w:tcPr>
+          <w:p>
+            <w:pPr>
+              <w:spacing w:after="0"/>
+            </w:pPr>
+            <w:r>
+              <w:rPr>
+                <w:sz w:val="19"/>
+              </w:rPr>
+              <w:t>공개 약관에는 고정 만료일이 명시되지 않음. 다만 회원 개인정보 보유기간은 2년마다 재동의가 필요하며, 만료 시 키가 중지될 수 있음.</w:t>
+            </w:r>
+          </w:p>
+        </w:tc>
+        <w:tc>
+          <w:tcPr>
+            <w:tcW w:type="dxa" w:w="3910"/>
+          </w:tcPr>
+          <w:p>
+            <w:pPr>
+              <w:spacing w:after="0"/>
+            </w:pPr>
+            <w:r>
+              <w:rPr>
+                <w:sz w:val="19"/>
+              </w:rPr>
+              <w:t>반기마다 인증키 관리·이용현황과 계정 재동의 상태를 확인. 수집 실패 코드 901을 긴급 점검 신호로 처리.</w:t>
+            </w:r>
+          </w:p>
+        </w:tc>
+      </w:tr>
+      <w:tr>
+        <w:trPr>
+          <w:cantSplit/>
+        </w:trPr>
+        <w:tc>
+          <w:tcPr>
+            <w:tcW w:type="dxa" w:w="1800"/>
+          </w:tcPr>
+          <w:p>
+            <w:pPr>
+              <w:spacing w:after="0"/>
+            </w:pPr>
+            <w:r>
+              <w:rPr>
+                <w:sz w:val="19"/>
+              </w:rPr>
+              <w:t>실시간 시세 분배 계약</w:t>
+            </w:r>
+          </w:p>
+        </w:tc>
+        <w:tc>
+          <w:tcPr>
+            <w:tcW w:type="dxa" w:w="3650"/>
+          </w:tcPr>
+          <w:p>
+            <w:pPr>
+              <w:spacing w:after="0"/>
+            </w:pPr>
+            <w:r>
+              <w:rPr>
+                <w:sz w:val="19"/>
+              </w:rPr>
+              <w:t>미체결·보류. 현재 출시 범위에는 실시간 체결가·분봉 차트 미포함.</w:t>
+            </w:r>
+          </w:p>
+        </w:tc>
+        <w:tc>
+          <w:tcPr>
+            <w:tcW w:type="dxa" w:w="3910"/>
+          </w:tcPr>
+          <w:p>
+            <w:pPr>
+              <w:spacing w:after="0"/>
+            </w:pPr>
+            <w:r>
+              <w:rPr>
+                <w:sz w:val="19"/>
+              </w:rPr>
+              <w:t>계약 체결 전에는 일별 API를 통한 상장일 21:00 실측만 제공. 실시간 화면은 계약·재배포 권한·수신 서버 승인 뒤 별도 기능으로 활성화.</w:t>
+            </w:r>
+          </w:p>
+        </w:tc>
+      </w:tr>
+    </w:tbl>
+    <w:p>
+      <w:pPr>
+        <w:spacing w:after="40"/>
+      </w:pPr>
+    </w:p>
+    <w:tbl>
+      <w:tblPr>
+        <w:tblW w:type="dxa" w:w="9360"/>
+        <w:tblLayout w:type="fixed"/>
+        <w:tblLook w:firstColumn="1" w:firstRow="1" w:lastColumn="0" w:lastRow="0" w:noHBand="0" w:noVBand="1" w:val="04A0"/>
+        <w:tblInd w:w="120" w:type="dxa"/>
+      </w:tblPr>
+      <w:tblGrid>
+        <w:gridCol w:w="9360"/>
+      </w:tblGrid>
+      <w:tr>
+        <w:trPr>
+          <w:tblHeader w:val="true"/>
+        </w:trPr>
+        <w:tc>
+          <w:tcPr>
+            <w:tcW w:type="dxa" w:w="9360"/>
+            <w:vAlign w:val="center"/>
+            <w:tcMar>
+              <w:top w:w="80" w:type="dxa"/>
+              <w:start w:w="120" w:type="dxa"/>
+              <w:bottom w:w="80" w:type="dxa"/>
+              <w:end w:w="120" w:type="dxa"/>
+            </w:tcMar>
+            <w:shd w:fill="F4F6F9"/>
+          </w:tcPr>
+          <w:p>
+            <w:pPr>
+              <w:spacing w:after="40"/>
+            </w:pPr>
+            <w:r>
+              <w:rPr>
+                <w:b/>
+                <w:color w:val="1F4D78"/>
+              </w:rPr>
+              <w:t>갱신 일정의 의미</w:t>
+            </w:r>
+          </w:p>
+          <w:p>
+            <w:pPr>
+              <w:spacing w:after="0"/>
+            </w:pPr>
+            <w:r>
+              <w:t>2027-08-24 이후에는 KRX 일별 API 수집이 중단될 수 있으므로, 30일 전부터 갱신과 샘플 호출을 완료한다. 실시간 시세 계약 보류는 기능 보류일 뿐이며, 상장 전 예측·상장일 21:00 실측·모델 재학습은 승인된 일별 API만으로 계속 운영한다.</w:t>
+            </w:r>
+          </w:p>
+        </w:tc>
+      </w:tr>
+    </w:tbl>
+    <w:p>
+      <w:pPr>
+        <w:spacing w:after="40"/>
+      </w:pPr>
+    </w:p>
+    <w:p>
+      <w:pPr>
+        <w:pStyle w:val="Heading1"/>
+      </w:pPr>
+      <w:r>
+        <w:t>11. 단계별 구현 로드맵</w:t>
       </w:r>
     </w:p>
     <w:tbl>
@@ -4128,6 +5259,7 @@
       <w:tr>
         <w:trPr>
           <w:tblHeader w:val="true"/>
+          <w:cantSplit/>
         </w:trPr>
         <w:tc>
           <w:tcPr>
@@ -4181,6 +5313,9 @@
         </w:tc>
       </w:tr>
       <w:tr>
+        <w:trPr>
+          <w:cantSplit/>
+        </w:trPr>
         <w:tc>
           <w:tcPr>
             <w:tcW w:type="dxa" w:w="1900"/>
@@ -4209,12 +5344,15 @@
               <w:rPr>
                 <w:sz w:val="19"/>
               </w:rPr>
-              <w:t>DART 키 발급, KRX 이용·재배포 범위 확인, Secret 저장소와 역할 정의</w:t>
+              <w:t>DART 키 발급, 승인된 KRX 일별 API의 Secret 등록, 갱신 일정·역할 정의. 실시간 시세 계약은 보류</w:t>
             </w:r>
           </w:p>
         </w:tc>
       </w:tr>
       <w:tr>
+        <w:trPr>
+          <w:cantSplit/>
+        </w:trPr>
         <w:tc>
           <w:tcPr>
             <w:tcW w:type="dxa" w:w="1900"/>
@@ -4249,6 +5387,9 @@
         </w:tc>
       </w:tr>
       <w:tr>
+        <w:trPr>
+          <w:cantSplit/>
+        </w:trPr>
         <w:tc>
           <w:tcPr>
             <w:tcW w:type="dxa" w:w="1900"/>
@@ -4283,6 +5424,9 @@
         </w:tc>
       </w:tr>
       <w:tr>
+        <w:trPr>
+          <w:cantSplit/>
+        </w:trPr>
         <w:tc>
           <w:tcPr>
             <w:tcW w:type="dxa" w:w="1900"/>
@@ -4317,6 +5461,9 @@
         </w:tc>
       </w:tr>
       <w:tr>
+        <w:trPr>
+          <w:cantSplit/>
+        </w:trPr>
         <w:tc>
           <w:tcPr>
             <w:tcW w:type="dxa" w:w="1900"/>
@@ -4434,6 +5581,7 @@
       <w:tr>
         <w:trPr>
           <w:tblHeader w:val="true"/>
+          <w:cantSplit/>
         </w:trPr>
         <w:tc>
           <w:tcPr>
@@ -4512,6 +5660,9 @@
         </w:tc>
       </w:tr>
       <w:tr>
+        <w:trPr>
+          <w:cantSplit/>
+        </w:trPr>
         <w:tc>
           <w:tcPr>
             <w:tcW w:type="dxa" w:w="2200"/>
@@ -4562,6 +5713,9 @@
         </w:tc>
       </w:tr>
       <w:tr>
+        <w:trPr>
+          <w:cantSplit/>
+        </w:trPr>
         <w:tc>
           <w:tcPr>
             <w:tcW w:type="dxa" w:w="2200"/>
@@ -4612,6 +5766,9 @@
         </w:tc>
       </w:tr>
       <w:tr>
+        <w:trPr>
+          <w:cantSplit/>
+        </w:trPr>
         <w:tc>
           <w:tcPr>
             <w:tcW w:type="dxa" w:w="2200"/>
@@ -4662,6 +5819,9 @@
         </w:tc>
       </w:tr>
       <w:tr>
+        <w:trPr>
+          <w:cantSplit/>
+        </w:trPr>
         <w:tc>
           <w:tcPr>
             <w:tcW w:type="dxa" w:w="2200"/>
@@ -4712,6 +5872,9 @@
         </w:tc>
       </w:tr>
       <w:tr>
+        <w:trPr>
+          <w:cantSplit/>
+        </w:trPr>
         <w:tc>
           <w:tcPr>
             <w:tcW w:type="dxa" w:w="2200"/>
@@ -4762,6 +5925,9 @@
         </w:tc>
       </w:tr>
       <w:tr>
+        <w:trPr>
+          <w:cantSplit/>
+        </w:trPr>
         <w:tc>
           <w:tcPr>
             <w:tcW w:type="dxa" w:w="2200"/>
@@ -4923,6 +6089,66 @@
           <w:sz w:val="18"/>
         </w:rPr>
         <w:t>https://data.krx.co.kr/inc/datasale/Market%20Data%20Usage%20Polices_ko.pdf?v=20230121_1</w:t>
+      </w:r>
+    </w:p>
+    <w:p>
+      <w:pPr>
+        <w:spacing w:after="60"/>
+        <w:ind w:left="216"/>
+      </w:pPr>
+      <w:r>
+        <w:rPr>
+          <w:color w:val="505050"/>
+          <w:sz w:val="18"/>
+        </w:rPr>
+        <w:t xml:space="preserve">KRX OpenAPI 이용약관: 인증키 1년 유효기간, 연장, 호출 한도와 12개월 미사용 키 삭제 조건 참고. </w:t>
+      </w:r>
+      <w:r>
+        <w:rPr>
+          <w:color w:val="2E74B5"/>
+          <w:sz w:val="18"/>
+        </w:rPr>
+        <w:t>https://openapi.krx.co.kr/contents/OPP/INFO/OPPINFO002.jsp</w:t>
+      </w:r>
+    </w:p>
+    <w:p>
+      <w:pPr>
+        <w:spacing w:after="60"/>
+        <w:ind w:left="216"/>
+      </w:pPr>
+      <w:r>
+        <w:rPr>
+          <w:color w:val="505050"/>
+          <w:sz w:val="18"/>
+        </w:rPr>
+        <w:t xml:space="preserve">KRX 데이터 수신방법: 실시간·지연 시세는 별도 데이터 분배 계약이 필요함을 참고. </w:t>
+      </w:r>
+      <w:r>
+        <w:rPr>
+          <w:color w:val="2E74B5"/>
+          <w:sz w:val="18"/>
+        </w:rPr>
+        <w:t>https://openapi.krx.co.kr/contents/OPP/DATA/OPPDATA003.jsp</w:t>
+      </w:r>
+    </w:p>
+    <w:p>
+      <w:pPr>
+        <w:spacing w:after="60"/>
+        <w:ind w:left="216"/>
+      </w:pPr>
+      <w:r>
+        <w:rPr>
+          <w:color w:val="505050"/>
+          <w:sz w:val="18"/>
+        </w:rPr>
+        <w:t xml:space="preserve">OpenDART 오류 코드: 개인정보 보유기간 만료에 따른 인증키 중지(901) 참고. </w:t>
+      </w:r>
+      <w:r>
+        <w:rPr>
+          <w:color w:val="2E74B5"/>
+          <w:sz w:val="18"/>
+        </w:rPr>
+        <w:t>https://opendart.fss.or.kr/guide/detail.do?apiGrpCd=DE006&amp;apiId=AE00081</w:t>
       </w:r>
     </w:p>
     <w:sectPr>

</xml_diff>

<commit_message>
Use KRX OpenAPI for historical IPO collection
</commit_message>
<xml_diff>
--- a/docs/IPO_데이터_거버넌스_및_백엔드_파이프라인_설계서.docx
+++ b/docs/IPO_데이터_거버넌스_및_백엔드_파이프라인_설계서.docx
@@ -8,7 +8,7 @@
       </w:pPr>
       <w:r>
         <w:rPr>
-          <w:rFonts w:ascii="Calibri" w:hAnsi="Calibri" w:eastAsia="NanumGothic"/>
+          <w:rFonts w:ascii="Calibri" w:hAnsi="Calibri" w:eastAsia="AppleGothic"/>
           <w:b/>
           <w:color w:val="0B2545"/>
           <w:sz w:val="48"/>
@@ -757,7 +757,7 @@
               <w:spacing w:after="0"/>
             </w:pPr>
             <w:r>
-              <w:t>위 예시는 KRX OpenAPI 수집기 교체 후의 목표 설정이다. 현재 개인 로그인 방식 수집기는 공식 API 수집기로 교체되기 전까지 배포 환경에서 사용하지 않는다.</w:t>
+              <w:t>KRX 공식 OpenAPI 수집기가 적용됐다. 서비스는 KRX_API_KEY만 사용하며, 개인 웹사이트 로그인 ID·비밀번호 수집은 코드와 배포 환경에서 사용하지 않는다.</w:t>
             </w:r>
           </w:p>
         </w:tc>
@@ -6563,7 +6563,7 @@
       <w:spacing w:after="120" w:line="264" w:lineRule="auto"/>
     </w:pPr>
     <w:rPr>
-      <w:rFonts w:ascii="Calibri" w:hAnsi="Calibri" w:eastAsia="NanumGothic"/>
+      <w:rFonts w:ascii="Calibri" w:hAnsi="Calibri" w:eastAsia="AppleGothic"/>
       <w:sz w:val="22"/>
     </w:rPr>
   </w:style>
@@ -6626,7 +6626,7 @@
       <w:outlineLvl w:val="0"/>
     </w:pPr>
     <w:rPr>
-      <w:rFonts w:asciiTheme="majorHAnsi" w:eastAsiaTheme="majorEastAsia" w:hAnsiTheme="majorHAnsi" w:cstheme="majorBidi" w:ascii="Calibri" w:hAnsi="Calibri" w:eastAsia="NanumGothic"/>
+      <w:rFonts w:asciiTheme="majorHAnsi" w:eastAsiaTheme="majorEastAsia" w:hAnsiTheme="majorHAnsi" w:cstheme="majorBidi" w:ascii="Calibri" w:hAnsi="Calibri" w:eastAsia="AppleGothic"/>
       <w:b/>
       <w:bCs/>
       <w:color w:val="2E74B5"/>
@@ -6650,7 +6650,7 @@
       <w:outlineLvl w:val="1"/>
     </w:pPr>
     <w:rPr>
-      <w:rFonts w:asciiTheme="majorHAnsi" w:eastAsiaTheme="majorEastAsia" w:hAnsiTheme="majorHAnsi" w:cstheme="majorBidi" w:ascii="Calibri" w:hAnsi="Calibri" w:eastAsia="NanumGothic"/>
+      <w:rFonts w:asciiTheme="majorHAnsi" w:eastAsiaTheme="majorEastAsia" w:hAnsiTheme="majorHAnsi" w:cstheme="majorBidi" w:ascii="Calibri" w:hAnsi="Calibri" w:eastAsia="AppleGothic"/>
       <w:b/>
       <w:bCs/>
       <w:color w:val="2E74B5"/>
@@ -6674,7 +6674,7 @@
       <w:outlineLvl w:val="2"/>
     </w:pPr>
     <w:rPr>
-      <w:rFonts w:asciiTheme="majorHAnsi" w:eastAsiaTheme="majorEastAsia" w:hAnsiTheme="majorHAnsi" w:cstheme="majorBidi" w:ascii="Calibri" w:hAnsi="Calibri" w:eastAsia="NanumGothic"/>
+      <w:rFonts w:asciiTheme="majorHAnsi" w:eastAsiaTheme="majorEastAsia" w:hAnsiTheme="majorHAnsi" w:cstheme="majorBidi" w:ascii="Calibri" w:hAnsi="Calibri" w:eastAsia="AppleGothic"/>
       <w:b/>
       <w:bCs/>
       <w:color w:val="1F4D78"/>

</xml_diff>